<commit_message>
docs: aliniaza Anexa 1 la modificarile din versiunea incarcata
Titlul sectiunii de conditii si separatorul din titlurile de proiect
preluate ca in versiunea editata manual; textul 1.2 clarifica marcarea
proiectelor si actiunilor la cererea sponsorului.

Co-Authored-By: Claude Fable 5.1 <noreply@anthropic.com>
Claude-Session: https://claude.ai/code/session_01FMDaKFWCBd79s7bzinc7NH
</commit_message>
<xml_diff>
--- a/Docs/Anexa_1_Lista_proiecte_eligibile.docx
+++ b/Docs/Anexa_1_Lista_proiecte_eligibile.docx
@@ -99,7 +99,7 @@
           <w:sz w:val="20"/>
           <w:szCs w:val="20"/>
         </w:rPr>
-        <w:t xml:space="preserve">1.2. Prin prezenta anexă, Părțile stabilesc lista proiectelor eligibile la finanțare, grupate pe activitățile enumerate la art. 1.4 din contract și pe obiectivele prevăzute la art. 2.2 din Statutul Beneficiarului. Acțiunile (livrabilele) fiecărui proiect se marchează cu ☒ la cererea Sponsorului, la semnarea anexei; acțiunile nemarcate rămân eligibile și pot fi selectate ulterior prin act adițional, conform art. 9.3 din contract.</w:t>
+        <w:t xml:space="preserve">1.2. Prin prezenta anexă, Părțile stabilesc lista proiectelor eligibile la finanțare, grupate pe activitățile enumerate la art. 1.4 din contract și pe obiectivele prevăzute la art. 2.2 din Statutul Beneficiarului. Proiectele și acțiunile (livrabilele) finanțate se marchează cu ☒ la cererea Sponsorului, la semnarea anexei; cele nemarcate rămân eligibile și pot fi selectate ulterior prin act adițional, conform art. 9.3 din contract.</w:t>
       </w:r>
     </w:p>
     <w:p>
@@ -170,7 +170,7 @@
           <w:sz w:val="20"/>
           <w:szCs w:val="20"/>
         </w:rPr>
-        <w:t xml:space="preserve">Proiect 01 – Servicii religioase pentru membrii comunității evreiești</w:t>
+        <w:t xml:space="preserve">Proiect 01 - Servicii religioase pentru membrii comunității evreiești</w:t>
       </w:r>
     </w:p>
     <w:p>
@@ -1393,7 +1393,7 @@
           <w:sz w:val="20"/>
           <w:szCs w:val="20"/>
         </w:rPr>
-        <w:t xml:space="preserve">Proiect 02 – Reprezentarea membrilor comunității în relația cu autoritățile române</w:t>
+        <w:t xml:space="preserve">Proiect 02 - Reprezentarea membrilor comunității în relația cu autoritățile române</w:t>
       </w:r>
     </w:p>
     <w:p>
@@ -1739,7 +1739,7 @@
           <w:sz w:val="20"/>
           <w:szCs w:val="20"/>
         </w:rPr>
-        <w:t xml:space="preserve">Proiect 03 – Promovarea valorilor culturii ebraice și ale religiei iudaice</w:t>
+        <w:t xml:space="preserve">Proiect 03 - Promovarea valorilor culturii ebraice și ale religiei iudaice</w:t>
       </w:r>
     </w:p>
     <w:p>
@@ -2539,7 +2539,7 @@
           <w:sz w:val="20"/>
           <w:szCs w:val="20"/>
         </w:rPr>
-        <w:t xml:space="preserve">Proiect 04 – Asistența socială a persoanelor nevoiașe, în vârstă sau cu nevoi speciale</w:t>
+        <w:t xml:space="preserve">Proiect 04 - Asistența socială a persoanelor nevoiașe, în vârstă sau cu nevoi speciale</w:t>
       </w:r>
     </w:p>
     <w:p>
@@ -4044,7 +4044,7 @@
           <w:sz w:val="20"/>
           <w:szCs w:val="20"/>
         </w:rPr>
-        <w:t xml:space="preserve">Proiect 05 – Costurile de organizare și desfășurare a activităților de mai sus</w:t>
+        <w:t xml:space="preserve">Proiect 05 - Costurile de organizare și desfășurare a activităților de mai sus</w:t>
       </w:r>
     </w:p>
     <w:p>
@@ -4954,7 +4954,7 @@
           <w:sz w:val="20"/>
           <w:szCs w:val="20"/>
         </w:rPr>
-        <w:t xml:space="preserve">Proiect 06 – Proiect special: </w:t>
+        <w:t xml:space="preserve">Proiect 06 - Proiect special: </w:t>
       </w:r>
       <w:r>
         <w:rPr>
@@ -5909,7 +5909,7 @@
           <w:sz w:val="22"/>
           <w:szCs w:val="22"/>
         </w:rPr>
-        <w:t xml:space="preserve">3. Condiții de eligibilitate</w:t>
+        <w:t xml:space="preserve">3. Condiții de eligibilitate aplicabile fiecărui proiect bifat</w:t>
       </w:r>
     </w:p>
     <w:p>

</xml_diff>